<commit_message>
Auto commit (2026-10-22 18:39) — 4 changes
Claude Code 세션 종료 시 자동 커밋.

Co-Authored-By: Claude <noreply@anthropic.com>
</commit_message>
<xml_diff>
--- a/projects/15_reign_predators_office/군림_포식자의 오피스_1-50화_대본 검토_v2.docx
+++ b/projects/15_reign_predators_office/군림_포식자의 오피스_1-50화_대본 검토_v2.docx
@@ -599,7 +599,7 @@
         <w:pStyle w:val="ListBullet"/>
       </w:pPr>
       <w:r>
-        <w:t>어디가 찢겼는지 정해 주시면 됩니다. 8화를 「세아의 블라우스 어깨를 잡아 찢는다.」로 하면, 앞섶 단추가 남아 10화 그대로 됩니다.</w:t>
+        <w:t>어디가 찢겼는지 정해 주시면 됩니다. 8화를 「세아의 블라우스 어깨를 잡아 찢는다.」로 하면, 블라우스 앞 단추가 그대로 남아 10화를 고치지 않아도 됩니다.</w:t>
       </w:r>
     </w:p>
     <w:p>
@@ -607,7 +607,7 @@
         <w:pStyle w:val="ListBullet"/>
       </w:pPr>
       <w:r>
-        <w:t>같은 차림이 13화 S#2 복도까지 이어집니다. 세아는 10화에 옷을 벗고 11화까지 「속옷만 입은」 상태인데, 13화에 옷 입는 지문 없이 호텔 복도로 나옵니다. 「찢어진 블라우스를 대충 걸치고 앞섶을 움켜쥔 세아」처럼 한 줄 정해 주세요.</w:t>
+        <w:t>세아의 옷 문제는 13화 S#2 복도까지 이어집니다. 세아는 10화에 옷을 벗고 11화까지 「속옷만 입은」 상태인데, 13화에 옷 입는 지문 없이 호텔 복도로 나옵니다. 「찢어진 블라우스를 대충 걸치고 앞섶을 움켜쥔 세아」처럼 한 줄 정해 주세요.</w:t>
       </w:r>
     </w:p>
     <w:p>
@@ -849,7 +849,7 @@
     </w:p>
     <w:p>
       <w:r>
-        <w:t>이 작품이 남자 시청자를 자극하는 방식은 이렇습니다. 민우를 깔보던 여자가 민우 앞에서 몸으로 무너지고, 다른 여자가 그걸 지켜보며 경쟁합니다. 아래는 그 장면이 짧게 지나가거나 시선이 다른 데로 가는 곳입니다.</w:t>
+        <w:t>이 작품이 남자 시청자를 자극하는 방식은 이렇습니다. 민우를 깔보던 여자가 민우 앞에서 몸을 내주며 굴복하고, 다른 여자가 그걸 지켜보며 민우를 차지하려고 서로 경쟁합니다. 아래는 그 장면이 짧게 지나가거나 시선이 다른 데로 가는 곳입니다.</w:t>
       </w:r>
     </w:p>
     <w:p>
@@ -1001,7 +1001,7 @@
         <w:pStyle w:val="ListBullet"/>
       </w:pPr>
       <w:r>
-        <w:t>전편 지문에서 여자 몸을 짚는 줄은 97줄, 민우 몸을 짚는 줄은 6줄입니다. 그 6줄 가운데 3줄이 7화 끝과 8화 첫머리에 몰려 있습니다.</w:t>
+        <w:t>전편 지문에서 여자 몸을 묘사한 줄은 97줄, 민우 몸을 묘사한 줄은 6줄입니다. 그 6줄 가운데 3줄이 7화 끝과 8화 첫머리에 몰려 있습니다.</w:t>
       </w:r>
     </w:p>
     <w:p>
@@ -1201,7 +1201,7 @@
         <w:pStyle w:val="Heading3"/>
       </w:pPr>
       <w:r>
-        <w:t>6-8. 18~19화 — 민우가 스스로를 못 다스리는 말이 붙어 있습니다</w:t>
+        <w:t>6-8. 18~19화 — 지문이 민우를 스스로를 못 다스리는 사람처럼 그립니다</w:t>
       </w:r>
     </w:p>
     <w:p>
@@ -1217,7 +1217,7 @@
         <w:pStyle w:val="ListBullet"/>
       </w:pPr>
       <w:r>
-        <w:t>다만 아래 말들은 민우가 자기도 모르게 끌려가는 사람처럼 보이게 합니다. 「멍하니 바라본다」, 「자신도 모르게 서희에게 성큼 다가가」, 「아쉬운 듯 서희를 바라보다가, 겨우 등을 돌려세우는」</w:t>
+        <w:t>다만 아래 지문들은 민우가 자기도 모르게 서희에게 끌려가는 사람처럼 보이게 합니다. 「멍하니 바라본다」, 「자신도 모르게 서희에게 성큼 다가가」, 「아쉬운 듯 서희를 바라보다가, 겨우 등을 돌려세우는」</w:t>
       </w:r>
     </w:p>
     <w:p>
@@ -1225,7 +1225,7 @@
         <w:pStyle w:val="ListBullet"/>
       </w:pPr>
       <w:r>
-        <w:t>제안: 흔들림은 남기고, 마지막에 쥐는 쪽이 민우가 되게 합니다.</w:t>
+        <w:t>제안: 민우가 서희에게 흔들리는 모습은 남기되, 장면이 끝날 때는 민우가 서희를 쥐고 흔드는 쪽이 되게 합니다.</w:t>
       </w:r>
     </w:p>
     <w:p>

</xml_diff>